<commit_message>
A/B test (staging): "Meet first, pay when you hire"
- Variant A: $349 upfront (unchanged). Variant B: $49 deposit per hire,
  $300 balance when the family confirms a hire. Replacements stay free.
- 50/50 split per visitor (assets/ab.js, api/ab.js); ?variant=A|B to preview
- B copy on matches, pay and thank-you pages; deposit receipt email
- Hire is gated on the balance for B: Stripe checkout, or team marks it paid
- B refund rules for deposits
- Finance A/B panel: visitors, preferences, starts, balances, hires,
  revenue per 100 visitors
- Off unless AB_TEST=1; run supabase/ab-test.sql first
- PRD v1.5

Co-Authored-By: Claude Opus 5.5 <noreply@anthropic.com>
Claude-Session: https://claude.ai/code/session_012qfE3doHgYFjiArW2BrgMj
</commit_message>
<xml_diff>
--- a/docs/PRD.docx
+++ b/docs/PRD.docx
@@ -334,7 +334,7 @@
               <w:spacing w:after="0" w:line="264"/>
             </w:pPr>
             <w:r>
-              <w:t xml:space="preserve">1.4</w:t>
+              <w:t xml:space="preserve">1.5</w:t>
             </w:r>
           </w:p>
         </w:tc>
@@ -438,7 +438,59 @@
               <w:spacing w:after="0" w:line="264"/>
             </w:pPr>
             <w:r>
-              <w:t xml:space="preserve">Version 1.1 built on staging (October 20, 2026), waiting for approval before production</w:t>
+              <w:t xml:space="preserve">Version 1.1 and the pricing A/B test built on staging (October 20, 2026), waiting for approval before production</w:t>
+            </w:r>
+          </w:p>
+        </w:tc>
+      </w:tr>
+      <w:tr>
+        <w:tc>
+          <w:tcPr>
+            <w:tcW w:type="dxa" w:w="2600"/>
+            <w:tcBorders>
+              <w:top w:val="single" w:color="DDD5C8" w:sz="4"/>
+              <w:left w:val="single" w:color="DDD5C8" w:sz="4"/>
+              <w:bottom w:val="single" w:color="DDD5C8" w:sz="4"/>
+              <w:right w:val="single" w:color="DDD5C8" w:sz="4"/>
+            </w:tcBorders>
+            <w:tcMar>
+              <w:top w:type="dxa" w:w="80"/>
+              <w:left w:type="dxa" w:w="110"/>
+              <w:bottom w:type="dxa" w:w="80"/>
+              <w:right w:type="dxa" w:w="110"/>
+            </w:tcMar>
+          </w:tcPr>
+          <w:p>
+            <w:pPr>
+              <w:spacing w:after="0" w:line="264"/>
+            </w:pPr>
+            <w:r>
+              <w:t xml:space="preserve">Changes in 1.5</w:t>
+            </w:r>
+          </w:p>
+        </w:tc>
+        <w:tc>
+          <w:tcPr>
+            <w:tcW w:type="dxa" w:w="6760"/>
+            <w:tcBorders>
+              <w:top w:val="single" w:color="DDD5C8" w:sz="4"/>
+              <w:left w:val="single" w:color="DDD5C8" w:sz="4"/>
+              <w:bottom w:val="single" w:color="DDD5C8" w:sz="4"/>
+              <w:right w:val="single" w:color="DDD5C8" w:sz="4"/>
+            </w:tcBorders>
+            <w:tcMar>
+              <w:top w:type="dxa" w:w="80"/>
+              <w:left w:type="dxa" w:w="110"/>
+              <w:bottom w:type="dxa" w:w="80"/>
+              <w:right w:type="dxa" w:w="110"/>
+            </w:tcMar>
+          </w:tcPr>
+          <w:p>
+            <w:pPr>
+              <w:spacing w:after="0" w:line="264"/>
+            </w:pPr>
+            <w:r>
+              <w:t xml:space="preserve">A/B test of the business model: A = $349 upfront, B = $49 deposit + $300 when the family hires (see section 21).</w:t>
             </w:r>
           </w:p>
         </w:tc>
@@ -17098,6 +17150,164 @@
     </w:p>
     <w:p>
       <w:pPr>
+        <w:pStyle w:val="Heading2"/>
+      </w:pPr>
+      <w:r>
+        <w:t xml:space="preserve">A/B test: Meet first, pay when you hire (1.5)</w:t>
+      </w:r>
+    </w:p>
+    <w:p>
+      <w:pPr>
+        <w:pStyle w:val="ListParagraph"/>
+        <w:numPr>
+          <w:ilvl w:val="0"/>
+          <w:numId w:val="2"/>
+        </w:numPr>
+        <w:spacing w:after="60" w:line="288"/>
+      </w:pPr>
+      <w:r>
+        <w:rPr>
+          <w:b/>
+          <w:bCs/>
+        </w:rPr>
+        <w:t xml:space="preserve">Question:</w:t>
+      </w:r>
+      <w:r>
+        <w:t xml:space="preserve"> does lowering the upfront commitment bring in more revenue per ad click, without losing hires?</w:t>
+      </w:r>
+    </w:p>
+    <w:p>
+      <w:pPr>
+        <w:pStyle w:val="ListParagraph"/>
+        <w:numPr>
+          <w:ilvl w:val="0"/>
+          <w:numId w:val="2"/>
+        </w:numPr>
+        <w:spacing w:after="60" w:line="288"/>
+      </w:pPr>
+      <w:r>
+        <w:rPr>
+          <w:b/>
+          <w:bCs/>
+        </w:rPr>
+        <w:t xml:space="preserve">A (control):</w:t>
+      </w:r>
+      <w:r>
+        <w:t xml:space="preserve"> $349 per hire, paid upfront. </w:t>
+      </w:r>
+      <w:r>
+        <w:rPr>
+          <w:b/>
+          <w:bCs/>
+        </w:rPr>
+        <w:t xml:space="preserve">B:</w:t>
+      </w:r>
+      <w:r>
+        <w:t xml:space="preserve"> $49 deposit per hire, credited to the fee, plus a $300 balance paid when the family confirms the hire. Same $349 total; replacements stay free.</w:t>
+      </w:r>
+    </w:p>
+    <w:p>
+      <w:pPr>
+        <w:pStyle w:val="ListParagraph"/>
+        <w:numPr>
+          <w:ilvl w:val="0"/>
+          <w:numId w:val="2"/>
+        </w:numPr>
+        <w:spacing w:after="60" w:line="288"/>
+      </w:pPr>
+      <w:r>
+        <w:rPr>
+          <w:b/>
+          <w:bCs/>
+        </w:rPr>
+        <w:t xml:space="preserve">Split:</w:t>
+      </w:r>
+      <w:r>
+        <w:t xml:space="preserve"> 50/50 per visitor on first visit, remembered on that device. Team previews with ?variant=A or ?variant=B are not counted.</w:t>
+      </w:r>
+    </w:p>
+    <w:p>
+      <w:pPr>
+        <w:pStyle w:val="ListParagraph"/>
+        <w:numPr>
+          <w:ilvl w:val="0"/>
+          <w:numId w:val="2"/>
+        </w:numPr>
+        <w:spacing w:after="60" w:line="288"/>
+      </w:pPr>
+      <w:r>
+        <w:rPr>
+          <w:b/>
+          <w:bCs/>
+        </w:rPr>
+        <w:t xml:space="preserve">B protections:</w:t>
+      </w:r>
+      <w:r>
+        <w:t xml:space="preserve"> applicant contact details are only shared after the balance is paid (online through Stripe, or marked paid by Finance or the Concierge).</w:t>
+      </w:r>
+    </w:p>
+    <w:p>
+      <w:pPr>
+        <w:pStyle w:val="ListParagraph"/>
+        <w:numPr>
+          <w:ilvl w:val="0"/>
+          <w:numId w:val="2"/>
+        </w:numPr>
+        <w:spacing w:after="60" w:line="288"/>
+      </w:pPr>
+      <w:r>
+        <w:rPr>
+          <w:b/>
+          <w:bCs/>
+        </w:rPr>
+        <w:t xml:space="preserve">B refunds:</w:t>
+      </w:r>
+      <w:r>
+        <w:t xml:space="preserve"> deposit fully refunded before applicants are shared or if there is no suitable match within 14 days; otherwise no refund, and nothing more to pay unless the family hires.</w:t>
+      </w:r>
+    </w:p>
+    <w:p>
+      <w:pPr>
+        <w:pStyle w:val="ListParagraph"/>
+        <w:numPr>
+          <w:ilvl w:val="0"/>
+          <w:numId w:val="2"/>
+        </w:numPr>
+        <w:spacing w:after="60" w:line="288"/>
+      </w:pPr>
+      <w:r>
+        <w:rPr>
+          <w:b/>
+          <w:bCs/>
+        </w:rPr>
+        <w:t xml:space="preserve">Decision metric:</w:t>
+      </w:r>
+      <w:r>
+        <w:t xml:space="preserve"> revenue per 100 visitors after refunds, with at least about 40% of B depositors hiring. Minimum about 300 visitors per side, plus about 2 weeks for hires to happen.</w:t>
+      </w:r>
+    </w:p>
+    <w:p>
+      <w:pPr>
+        <w:pStyle w:val="ListParagraph"/>
+        <w:numPr>
+          <w:ilvl w:val="0"/>
+          <w:numId w:val="2"/>
+        </w:numPr>
+        <w:spacing w:after="60" w:line="288"/>
+      </w:pPr>
+      <w:r>
+        <w:rPr>
+          <w:b/>
+          <w:bCs/>
+        </w:rPr>
+        <w:t xml:space="preserve">Where:</w:t>
+      </w:r>
+      <w:r>
+        <w:t xml:space="preserve"> staging only (AB_TEST=1) until approved. Results are in Finance → Overview → A/B test. Check fee timing rules with counsel; a fee charged at hire may suit employment agency rules better.</w:t>
+      </w:r>
+    </w:p>
+    <w:p>
+      <w:pPr>
         <w:spacing w:after="120"/>
       </w:pPr>
     </w:p>
@@ -17500,7 +17710,7 @@
         <w:sz w:val="18"/>
         <w:szCs w:val="18"/>
       </w:rPr>
-      <w:t xml:space="preserve">handmatch Web App PRD · v1.4 · Page </w:t>
+      <w:t xml:space="preserve">handmatch Web App PRD · v1.5 · Page </w:t>
     </w:r>
     <w:r>
       <w:rPr>

</xml_diff>